<commit_message>
docs: update architectural documentation and README to reflect microservice infrastructure and cloud deployment strategy
</commit_message>
<xml_diff>
--- a/docs/Architekturdokumentation.docx
+++ b/docs/Architekturdokumentation.docx
@@ -20,7 +20,7 @@
     </w:p>
     <w:p>
       <w:r>
-        <w:t>Diese Dokumentation beschreibt die logische und physische Architektur des Aether Motors Webshops. Sie folgt der Vorlesungsstruktur (Architecture Component Descriptions, Architecture Decision Records, Deployment Decision Records) und beschreibt den realen Stand des Repositories nach Einführung von MinIO (Object Storage für Bildmaterial) und Redis (verteilter Warenkorb-Cache).</w:t>
+        <w:t>Diese Dokumentation beschreibt die logische und physische Architektur des Aether Motors Webshops nach dem letzten Refactoring (Database-per-Service auch für Bestellungen, verteiltes Object Storage über MinIO, Wegfall lokal duplizierter Stub-Daten im SSR-Backend). Sie folgt der Vorlesungsstruktur: Architecture Component Descriptions, Architecture Decision Records, Deployment Decision Records.</w:t>
       </w:r>
     </w:p>
     <w:p>
@@ -36,7 +36,7 @@
     </w:p>
     <w:p>
       <w:r>
-        <w:t>Aether Motors realisiert einen 3-Tier-Microservice-Webshop. Der Presentation Tier wird vollständig vom Web Shop Backend Server-seitig gerendert und dient gleichzeitig als API-Gateway zu den nachgelagerten Microservices. Der Business Logic Tier besteht aus sieben fachlich geschnittenen Services (Product, Cart, Order, Media, Route, AI, Roadmap). Der Data Tier umfasst eine relationale MySQL-Datenbank, einen Redis-Cache sowie einen MinIO-Bucket für sämtliche Bildinhalte. Eine grafische Übersicht liefert das begleitende Foliendokument Architekturmodellierung.pptx.</w:t>
+        <w:t>Aether Motors realisiert einen 3-Tier-Microservice-Webshop. Der Presentation Tier wird vollständig vom Web Shop Backend Server-seitig gerendert und dient gleichzeitig als API-Gateway zu den nachgelagerten Microservices. Der Business Logic Tier besteht aus sieben fachlich geschnittenen Services (Product, Cart, Order, Media, Route, AI, Roadmap). Der Data Tier umfasst zwei voneinander unabhängige MySQL-Instanzen (eine für den Produktkatalog, eine für Bestellungen), einen Redis-Cache für Warenkörbe sowie einen MinIO-Bucket für sämtliche Bildinhalte. Eine grafische Übersicht liefert das begleitende Foliendokument Architekturmodellierung.pptx.</w:t>
       </w:r>
     </w:p>
     <w:p>
@@ -60,7 +60,7 @@
     </w:p>
     <w:p>
       <w:r>
-        <w:t>Das Web Shop Frontend ist der vom Endkunden bediente Tier 1. Es besteht ausschließlich aus vom Web Shop Backend ausgeliefertem HTML, eingebettetem CSS sowie minimalen JavaScript-Inseln (z. B. Konfigurator-Interaktion, YouTube-Modal). Da kein Single-Page-Application-Framework aktiv ist, ist der Browser zustandslos – jeglicher Zustand liegt im Web Shop Backend bzw. in den Microservices. Lediglich die Cart-ID wird in einem Cookie persistiert, um zwischen Requests denselben Cart wiederzufinden.</w:t>
+        <w:t>Das Web Shop Frontend ist der vom Endkunden bediente Tier 1. Es besteht ausschließlich aus vom Web Shop Backend ausgeliefertem HTML, eingebettetem CSS sowie minimalen JavaScript-Inseln (z. B. Konfigurator-Interaktion, YouTube-Modal). Da kein Single-Page-Application-Framework aktiv ist, ist der Browser zustandslos – jeglicher Zustand liegt im Web Shop Backend bzw. in den Microservices. Lediglich die Cart-ID wird in einem httpOnly-Cookie persistiert, um zwischen Requests denselben Cart wiederzufinden. Bilder werden vom Browser direkt aus dem MinIO-Bucket geladen (anonyme Read-Zugriffe).</w:t>
       </w:r>
     </w:p>
     <w:p>
@@ -73,7 +73,7 @@
     </w:p>
     <w:p>
       <w:r>
-        <w:t>Das Web Shop Backend (Express + EJS, Port 3000) erfüllt zwei Aufgaben: (1) Server-Side Rendering aller Seiten (Home, Konfigurator, Galerie, Merchandise, Roadmap, Route) und (2) API-Gateway, das HTTP-Aufrufe an die Microservices weiterleitet. Eingehende Requests werden ausschließlich vom Backend bedient; Microservices sind nicht direkt öffentlich erreichbar. Das Backend ist einem unpredictable Workload ausgesetzt und muss daher elastisch horizontal skalieren (siehe ADR5).</w:t>
+        <w:t>Das Web Shop Backend (Express + EJS, Port 3000) erfüllt zwei Aufgaben: (1) Server-Side Rendering aller Seiten (Home, Konfigurator, Galerie, Merchandise, Cart, Roadmap, Route) und (2) API-Gateway, das HTTP-Aufrufe an die Microservices weiterleitet. Eingehende Requests werden ausschließlich vom Backend bedient; Microservices sind nicht direkt öffentlich erreichbar. Daten zu Fahrzeugen und Merchandise zieht das Backend zur Laufzeit über HTTP/JSON vom Product Information Service (siehe ACD3); ein lokaler Cache mit 60 s TTL verhindert eine DB-Anfrage pro Render. Das Backend ist einem unpredictable Workload ausgesetzt und muss daher elastisch horizontal skalieren (siehe ADR5).</w:t>
       </w:r>
     </w:p>
     <w:p>
@@ -86,7 +86,7 @@
     </w:p>
     <w:p>
       <w:r>
-        <w:t>Der Product Information Service (Node.js, Port 3001) verwaltet sämtliche Stammdaten zu Fahrzeugen und Merchandise-Artikeln. Er stellt CRUD-Endpunkte über HTTP/JSON bereit und hält die Daten in der zugehörigen MySQL-Datenbank (siehe ACD10 und ADR7). Der Service ist – wie das Web Shop Backend – einem unpredictable Workload ausgesetzt und wird elastisch horizontal skaliert.</w:t>
+        <w:t>Der Product Information Service (Node.js, Port 3001) verwaltet sämtliche Stammdaten zu Fahrzeugen, Merchandise und allen Konfigurator-Optionen (Farben, Räder, Interieurs, Fahrwerke, Auspuffanlagen) inklusive der Verfügbarkeits-Joins pro Fahrzeug. Er stellt REST/JSON-Endpunkte unter /api/vehicles, /api/merchandise, /api/options und /api/search bereit und hält die Daten in der zugehörigen MySQL-Datenbank (siehe ACD10 und ADR7). Der Service ist – wie das Web Shop Backend – einem unpredictable Workload ausgesetzt und wird elastisch horizontal skaliert.</w:t>
       </w:r>
     </w:p>
     <w:p>
@@ -99,7 +99,7 @@
     </w:p>
     <w:p>
       <w:r>
-        <w:t>Der Shopping Cart Service (Node.js, Port 3002) verwaltet kundenspezifische Warenkörbe. Jeder Cart wird als JSON-Dokument in Redis unter dem Schlüssel &lt;prefix&gt;:&lt;cartId&gt; abgelegt und bei jeder Mutation mit einer sliding TTL neu geschrieben (Default 24 h, siehe ADR8). Eine eigene Datenbank pro Service ist hier bewusst durch einen In-Memory Cache ersetzt, weil Carts kurzlebig und nicht transaktionssicher zu persistieren sind. Da viele Kunden parallel einkaufen, ist der Workload unpredictable; der Service skaliert horizontal hinter einem Load Balancer.</w:t>
+        <w:t>Der Shopping Cart Service (Node.js, Port 3002) verwaltet kundenspezifische Warenkörbe. Jeder Cart wird als JSON-Dokument in Redis unter dem Schlüssel aether:cart:&lt;cartId&gt; abgelegt und bei jeder Mutation mit einer Sliding TTL neu geschrieben (Default 24 h, siehe ADR8). Da viele Kunden parallel einkaufen, ist der Workload unpredictable; der Service skaliert horizontal hinter einem Load Balancer und ist selbst zustandslos – der gesamte Zustand liegt in Redis (siehe ACD11).</w:t>
       </w:r>
     </w:p>
     <w:p>
@@ -112,7 +112,7 @@
     </w:p>
     <w:p>
       <w:r>
-        <w:t>Der Order Service (Node.js, Port 3003) wandelt einen Cart in eine Bestellung um und führt einfache Bestellverwaltungsfunktionen aus. Er ruft den Cart Service über die HTTP-API auf, um den finalen Warenkorbinhalt zu übernehmen. In der aktuellen Ausbaustufe ist der Workload predictable, sodass ein einzelner Replica-Container ausreicht.</w:t>
+        <w:t>Der Order Service (Node.js, Port 3003) übernimmt Vehicle- und Merchandise-Bestellungen aus dem Checkout, persistiert sie und stellt Bestellhistorie-Endpunkte bereit. Bestellungen werden in der eigenen MySQL-Instanz aether_orders abgelegt (siehe ACD13 und ADR11); JSON-Felder wie Customer, Address, Config und Items werden serialisiert in TEXT-Spalten gespeichert. Der Service ist zustandslos und kann beliebig horizontal skalieren; der gesamte transaktionale Zustand liegt in der Datenbank.</w:t>
       </w:r>
     </w:p>
     <w:p>
@@ -151,7 +151,7 @@
     </w:p>
     <w:p>
       <w:r>
-        <w:t>Der AI Service (Node.js, Port 3006) generiert auf Basis natürlich-sprachlicher Kundenwünsche eine passende Fahrzeugkonfiguration. Im Regelbetrieb wird Google Gemini (Modell konfigurierbar via GEMINI_MODEL) aufgerufen; ist kein API-Key gesetzt, antwortet der Service deterministisch mit der ersten verfügbaren Option pro Konfigurations-kategorie und markiert die Antwort über meta.fallback (siehe ADR10). Dadurch funktioniert die Demo auch ohne externe Abhängigkeit.</w:t>
+        <w:t>Der AI Service (Node.js, Port 3006) generiert auf Basis natürlich-sprachlicher Kundenwünsche eine passende Fahrzeugkonfiguration. Im Regelbetrieb wird Google Gemini (Modell konfigurierbar via GEMINI_MODEL) aufgerufen; ist kein API-Key gesetzt oder schlägt der Aufruf fehl, antwortet der Service deterministisch mit der ersten verfügbaren Option pro Konfigurationskategorie und markiert die Antwort über meta.fallback (siehe ADR10). Dadurch funktioniert die Demo auch ohne externe Abhängigkeit.</w:t>
       </w:r>
     </w:p>
     <w:p>
@@ -172,12 +172,12 @@
         <w:pStyle w:val="berschrift2"/>
       </w:pPr>
       <w:r>
-        <w:t>ACD10: Product Information Database (MySQL)</w:t>
-      </w:r>
-    </w:p>
-    <w:p>
-      <w:r>
-        <w:t>Eine relationale MySQL-Datenbank (Port 3306) hält sämtliche Produktinformationen. Schema und Seed-Daten werden über services/product-service/aether_motors.sql beim ersten Container-Start eingespielt. Die Datenbank ist gemäß Database-per-Service-Pattern (ADR7) ausschließlich dem Product Information Service zugänglich; alle anderen Komponenten greifen über dessen HTTP-API zu.</w:t>
+        <w:t>ACD10: Catalogue Database (MySQL, aether_motors)</w:t>
+      </w:r>
+    </w:p>
+    <w:p>
+      <w:r>
+        <w:t>Eine relationale MySQL-Datenbank (Container mysql, Host-Port 3306) hält sämtliche Produkt- und Optionsstammdaten. Schema und Seed-Daten werden über services/product-service/aether_motors.sql beim ersten Container-Start automatisch eingespielt. Die Datenbank ist gemäß Database-per-Service-Pattern (ADR7) ausschließlich dem Product Information Service zugänglich; alle anderen Komponenten greifen über dessen HTTP-API zu.</w:t>
       </w:r>
     </w:p>
     <w:p>
@@ -190,7 +190,7 @@
     </w:p>
     <w:p>
       <w:r>
-        <w:t>Ein einzelner Redis-Container (Port 6379) persistiert die Warenkörbe des Cart Service. Persistenz erfolgt über Append-Only-File (--appendonly yes) auf einem Docker-Volume, sodass Cart-Daten einen Container-Neustart überleben. Die TTL pro Eintrag ist konfigurierbar (REDIS_TTL_SECONDS) und wird bei jeder Mutation refreshed.</w:t>
+        <w:t>Ein Redis-Container (Port 6379) persistiert die Warenkörbe des Cart Service. Persistenz erfolgt über Append-Only-File (--appendonly yes) auf einem Docker-Volume, sodass Cart-Daten einen Container-Neustart überleben. Die TTL pro Eintrag ist konfigurierbar (REDIS_TTL_SECONDS) und wird bei jeder Mutation refreshed; abgebrochene Sitzungen verschwinden so automatisch.</w:t>
       </w:r>
     </w:p>
     <w:p>
@@ -204,6 +204,19 @@
     <w:p>
       <w:r>
         <w:t>MinIO ist die S3-kompatible Object-Storage-Komponente des Systems und beherbergt sämtliche Bild- und Mediendateien im Bucket aether-images. Der Bucket wird beim ersten docker-compose-Start automatisch durch den minio-init-Sidecar-Container angelegt und mit den im infrastructure/minio/seed-manifest.json hinterlegten Bildern befüllt. Anonyme Lese-Zugriffe sind erlaubt, sodass das SSR-Frontend die Objekte direkt referenzieren kann.</w:t>
+      </w:r>
+    </w:p>
+    <w:p>
+      <w:pPr>
+        <w:pStyle w:val="berschrift2"/>
+      </w:pPr>
+      <w:r>
+        <w:t>ACD13: Orders Database (MySQL, aether_orders)</w:t>
+      </w:r>
+    </w:p>
+    <w:p>
+      <w:r>
+        <w:t>Eine zweite, von der Katalog-DB getrennte MySQL-Instanz (Container mysql-orders, Host-Port 3307) hält ausschließlich Bestelldaten. Tabellen sind Orders, OrderItems sowie OrderEvents (Status-Audit); das Schema wird beim ersten Start aus services/order-service/orders.sql geladen. Die Datenbank ist gemäß Database-per-Service-Pattern (ADR7/ADR11) ausschließlich dem Order Service zugänglich. Die Trennung von ACD10 erlaubt unabhängige Backups, unterschiedliche Skalierungsstrategien und vermeidet, dass Bestelltransaktionen den Katalog-Traffic beeinflussen.</w:t>
       </w:r>
     </w:p>
     <w:p>
@@ -240,7 +253,7 @@
     </w:p>
     <w:p>
       <w:r>
-        <w:t>Die Komponenten werden in drei Tiers gegliedert: Presentation Tier (Web Shop Backend mit SSR), Business Logic Tier (sieben Microservices) und Data Tier (MySQL, Redis, MinIO). Diese Trennung erleichtert das Deployment (z. B. unterschiedliche Skalierungsstrategien je Tier) und die Absicherung (nur das Backend ist öffentlich erreichbar).</w:t>
+        <w:t>Die Komponenten werden in drei Tiers gegliedert: Presentation Tier (Web Shop Backend mit SSR), Business Logic Tier (sieben Microservices) und Data Tier (zwei MySQL-Instanzen, Redis, MinIO). Diese Trennung erleichtert das Deployment (z. B. unterschiedliche Skalierungsstrategien je Tier) und die Absicherung (nur das Backend ist öffentlich erreichbar).</w:t>
       </w:r>
     </w:p>
     <w:p>
@@ -279,33 +292,33 @@
     </w:p>
     <w:p>
       <w:r>
-        <w:t>Die Komponenten Web Shop Backend, Product Information Service und Cart Service sind einem unpredictable Workload ausgesetzt und werden daher elastisch horizontal skaliert. Die Skalierung erfolgt im Zielbetrieb über einen PaaS-Hosting-Service des Cloud-Providers. Voraussetzung dafür ist, dass die Services zustandslos sind – im Cart Service wird dies durch externe Persistenz in Redis (ADR8) sichergestellt.</w:t>
-      </w:r>
-    </w:p>
-    <w:p>
-      <w:pPr>
-        <w:pStyle w:val="berschrift2"/>
-      </w:pPr>
-      <w:r>
-        <w:t>ADR6: Relationale MySQL-Datenbank für den Product Information Microservice</w:t>
-      </w:r>
-    </w:p>
-    <w:p>
-      <w:r>
-        <w:t>Der Product Information Service verwaltet strukturierte Stammdaten (Fahrzeuge, Optionen, Merchandise) mit klaren Beziehungen, die Joins und komplexe Filter erfordern. Eine relationale Datenbank (MySQL 8) ist dafür das geeignete Persistenzmodell. Document- oder Key-Value-Stores wurden verworfen, weil sie die geforderten Join-Operationen nur umständlich abbilden würden.</w:t>
-      </w:r>
-    </w:p>
-    <w:p>
-      <w:pPr>
-        <w:pStyle w:val="berschrift2"/>
-      </w:pPr>
-      <w:r>
-        <w:t>ADR7: Database per Service für den Product Information Microservice</w:t>
-      </w:r>
-    </w:p>
-    <w:p>
-      <w:r>
-        <w:t>Die Produkt-Datenbank wird gemäß Database-per-Service-Pattern ausschließlich vom Product Information Service verwendet. Alle anderen Komponenten greifen über dessen HTTP-API auf die Produktdaten zu. Dadurch bleibt das Schema unabhängig veränderbar, ohne andere Services zu brechen.</w:t>
+        <w:t>Die Komponenten Web Shop Backend, Product Information Service und Cart Service sind einem unpredictable Workload ausgesetzt und werden daher elastisch horizontal skaliert. Die Skalierung erfolgt im Zielbetrieb über einen PaaS-Hosting-Service des Cloud-Providers. Voraussetzung dafür ist, dass die Services zustandslos sind – im Cart Service wird dies durch externe Persistenz in Redis (ADR8) sichergestellt; im Order Service entsprechend durch Persistenz in einer eigenen MySQL-Instanz (ADR11).</w:t>
+      </w:r>
+    </w:p>
+    <w:p>
+      <w:pPr>
+        <w:pStyle w:val="berschrift2"/>
+      </w:pPr>
+      <w:r>
+        <w:t>ADR6: Relationale MySQL-Datenbank für strukturierte Stammdaten</w:t>
+      </w:r>
+    </w:p>
+    <w:p>
+      <w:r>
+        <w:t>Sowohl die Produktstammdaten als auch Bestellungen weisen klar relationale Strukturen mit Joins, Constraints und Bedarf an Filtern/Aggregationen auf. Für beide wird MySQL 8 eingesetzt. Document- oder Key-Value-Stores wurden verworfen, weil sie die geforderten Join-Operationen nur umständlich abbilden würden.</w:t>
+      </w:r>
+    </w:p>
+    <w:p>
+      <w:pPr>
+        <w:pStyle w:val="berschrift2"/>
+      </w:pPr>
+      <w:r>
+        <w:t>ADR7: Database per Service</w:t>
+      </w:r>
+    </w:p>
+    <w:p>
+      <w:r>
+        <w:t>Jede Microservice-Komponente, die Persistenz benötigt, besitzt eine eigene Datenbank, die ausschließlich von diesem Service zugegriffen wird. Datenflüsse zwischen Services laufen ausnahmslos über die jeweiligen HTTP-APIs. Dadurch bleiben Schemas unabhängig veränderbar; ein Schema-Update in Service A erfordert keinen Eingriff in Service B.</w:t>
       </w:r>
     </w:p>
     <w:p>
@@ -318,7 +331,7 @@
     </w:p>
     <w:p>
       <w:r>
-        <w:t>Warenkörbe sind kurzlebig, lesbar/schreibend hochfrequent und müssen für die Lastverteilung (ADR5) services-extern gespeichert werden. Eine relationale Datenbank ist dafür überdimensioniert. Redis bietet O(1)-Zugriff per Key, TTL-basierten automatischen Cleanup und Append-Only-Persistenz. Der Cart Service schreibt jeden Cart bei Änderung mit SET … EX &lt;ttl&gt;, wodurch die TTL als Sliding Expiration wirkt: inaktive Carts verschwinden nach REDIS_TTL_SECONDS automatisch. Die vormals genutzte In-Memory Map wurde entfernt, weil sie horizontale Skalierung verhindert (siehe ADR5).</w:t>
+        <w:t>Warenkörbe sind kurzlebig, lesbar/schreibend hochfrequent und müssen für die Lastverteilung (ADR5) services-extern gespeichert werden. Eine relationale Datenbank ist dafür überdimensioniert. Redis bietet O(1)-Zugriff per Key, TTL-basierten automatischen Cleanup und Append-Only-Persistenz. Der Cart Service schreibt jeden Cart bei Änderung mit SET … EX &lt;ttl&gt;, wodurch die TTL als Sliding Expiration wirkt: inaktive Carts verschwinden nach REDIS_TTL_SECONDS automatisch.</w:t>
       </w:r>
     </w:p>
     <w:p>
@@ -331,7 +344,7 @@
     </w:p>
     <w:p>
       <w:r>
-        <w:t>Für Bild- und Mediendateien wird MinIO – S3-API-kompatibles Object Storage – eingesetzt. Im Vergleich zum vorherigen Verfahren (externe Hotlinks auf Google-CDNs) erlaubt MinIO kontrollierten Zugriff, unabhängiges Hosting und einfache Migration in produktive Cloud-Object-Stores (S3, GCS). Der minio-init-Sidecar lädt beim ersten Hochfahren des Stacks die im Manifest definierten Bilder einmalig in den Bucket. Anonyme Read-Zugriffe sind aktiviert, damit das SSR-Frontend Bilder direkt referenzieren kann.</w:t>
+        <w:t>Für Bild- und Mediendateien wird MinIO – S3-API-kompatibles Object Storage – eingesetzt. Im Vergleich zu lokalen Static-Files unter public/ erlaubt MinIO kontrollierten Zugriff, unabhängiges Hosting und einfache Migration in produktive Cloud-Object-Stores (S3, GCS). Der minio-init-Sidecar lädt beim ersten Hochfahren des Stacks die im Manifest definierten Bilder einmalig in den Bucket. Anonyme Read-Zugriffe sind aktiviert, damit das SSR-Frontend Bilder direkt referenzieren kann.</w:t>
       </w:r>
     </w:p>
     <w:p>
@@ -345,6 +358,32 @@
     <w:p>
       <w:r>
         <w:t>Der AI Service ist von einem externen LLM (Google Gemini) abhängig. Damit Demos, Reviews und Entwicklungs-Setups auch ohne API-Key funktionieren, antwortet der Service im Fehlerfall mit einer deterministischen Default-Konfiguration (jeweils erste Option pro Kategorie). Diese Antwort ist schema-identisch zur Live-Antwort; sie wird ausschließlich über meta.fallback = true markiert.</w:t>
+      </w:r>
+    </w:p>
+    <w:p>
+      <w:pPr>
+        <w:pStyle w:val="berschrift2"/>
+      </w:pPr>
+      <w:r>
+        <w:t>ADR11: Eigene Datenbank für den Order Service</w:t>
+      </w:r>
+    </w:p>
+    <w:p>
+      <w:r>
+        <w:t>Bestellungen werden in einer von der Katalog-DB getrennten MySQL-Instanz (aether_orders) persistiert. Damit gilt das Database-per-Service-Pattern (ADR7) konsequent auch für den Order Service. Vorteile: (a) Bestellungen können unabhängig vom Katalog gebackupt und skaliert werden, (b) Schreiblast aus dem Checkout-Prozess (Insert-lastig) beeinflusst die katalogseitigen Lese-Abfragen nicht, (c) datenschutzrelevante Bestellinformationen sind klar von den Stammdaten getrennt – wichtig für DSGVO-Audits.</w:t>
+      </w:r>
+    </w:p>
+    <w:p>
+      <w:pPr>
+        <w:pStyle w:val="berschrift2"/>
+      </w:pPr>
+      <w:r>
+        <w:t>ADR12: Kein duplizierter Produktkatalog im SSR-Backend</w:t>
+      </w:r>
+    </w:p>
+    <w:p>
+      <w:r>
+        <w:t>Das Web Shop Backend verwendet ausschließlich live-Daten des Product Information Service und hält keinen lokalen Stub bzw. JS-Fallback der Stammdaten mehr vor. Eine frühere Implementierung mit lokalen data/vehicles.js und data/merchandise.js wurde entfernt, da diese (a) DB- und Code-Daten auseinanderlaufen ließen, (b) ADR7 (Database-per-Service) im Geiste verletzten und (c) im Outage-Fall alte Preise an Kunden auslieferten. Stattdessen rendert das Backend bei Nichterreichbarkeit des Product Services eine ehrliche 503-Seite ("Aether is briefly offline"). Ein In-Process-Cache mit 60 s TTL fängt häufige Anfragen ab, sodass die DB nicht bei jedem Pageload getroffen wird.</w:t>
       </w:r>
     </w:p>
     <w:p>
@@ -368,7 +407,7 @@
     </w:p>
     <w:p>
       <w:r>
-        <w:t>Für die Entwicklung wird das gesamte System über docker-compose orchestriert. Jeder Microservice, MySQL, Redis und MinIO laufen in eigenen Containern auf einem gemeinsamen Docker-Netzwerk; Adminer und die MinIO-Konsole bieten GUI-Zugriff auf die Datenbestände. Dieser Aufbau ist mit einem einzelnen Befehl reproduzierbar.</w:t>
+        <w:t>Für die Entwicklung wird das gesamte System über docker-compose orchestriert. Jeder Microservice, beide MySQL-Instanzen, Redis und MinIO laufen in eigenen Containern auf einem gemeinsamen Docker-Netzwerk; Adminer (über beide MySQLs konfiguriert) und die MinIO-Konsole bieten GUI-Zugriff auf die Datenbestände. Dieser Aufbau ist mit einem einzelnen Befehl reproduzierbar.</w:t>
       </w:r>
     </w:p>
     <w:p>
@@ -407,20 +446,20 @@
     </w:p>
     <w:p>
       <w:r>
-        <w:t>Die fachlichen Microservices werden im Zielbetrieb in AWS ECS Fargate ausgeführt. Fargate liefert serverlose Container-Ausführung, eignet sich gut für die meist leichtgewichtigen Node-Services und erlaubt unterschiedliche Skalierungsprofile pro Service (Cart und Product elastisch, Roadmap und Route in fixer Replica-Zahl).</w:t>
-      </w:r>
-    </w:p>
-    <w:p>
-      <w:pPr>
-        <w:pStyle w:val="berschrift2"/>
-      </w:pPr>
-      <w:r>
-        <w:t>DDR5: AWS RDS for MySQL für die Produkt-Datenbank</w:t>
-      </w:r>
-    </w:p>
-    <w:p>
-      <w:r>
-        <w:t>Die Produkt-Datenbank wird im Zielbetrieb als Managed-Service (AWS RDS for MySQL) bereitgestellt. RDS übernimmt Backups, Patching, Multi-AZ-Failover und Monitoring. Dies passt zu ADR6/ADR7, ohne dass eine eigene Datenbank-Administration nötig wird.</w:t>
+        <w:t>Die fachlichen Microservices werden im Zielbetrieb in AWS ECS Fargate ausgeführt. Fargate liefert serverlose Container-Ausführung, eignet sich gut für die meist leichtgewichtigen Node-Services und erlaubt unterschiedliche Skalierungsprofile pro Service (Product und Cart elastisch, Roadmap und Route in fixer Replica-Zahl).</w:t>
+      </w:r>
+    </w:p>
+    <w:p>
+      <w:pPr>
+        <w:pStyle w:val="berschrift2"/>
+      </w:pPr>
+      <w:r>
+        <w:t>DDR5: AWS RDS for MySQL für die Katalog-Datenbank</w:t>
+      </w:r>
+    </w:p>
+    <w:p>
+      <w:r>
+        <w:t>Die Katalog-Datenbank (ACD10) wird im Zielbetrieb als Managed-Service (AWS RDS for MySQL) bereitgestellt. RDS übernimmt Backups, Patching, Multi-AZ-Failover und Monitoring. Dies passt zu ADR6 und ADR7, ohne dass eine eigene Datenbank-Administration nötig wird.</w:t>
       </w:r>
     </w:p>
     <w:p>
@@ -454,12 +493,25 @@
         <w:pStyle w:val="berschrift2"/>
       </w:pPr>
       <w:r>
-        <w:t>DDR8: Geheimnisverwaltung über Umgebungsvariablen / Secrets Manager</w:t>
-      </w:r>
-    </w:p>
-    <w:p>
-      <w:r>
-        <w:t>Sensible Werte (Datenbankzugang, MinIO-Credentials, GEMINI_API_KEY) werden im Code niemals fest hinterlegt. Lokal werden sie über docker-compose-Variablen gesetzt; im Zielbetrieb stammen sie aus AWS Secrets Manager und werden den Containern als Environment-Variablen injiziert.</w:t>
+        <w:t>DDR8: Geheimnisverwaltung über Secrets Manager</w:t>
+      </w:r>
+    </w:p>
+    <w:p>
+      <w:r>
+        <w:t>Sensible Werte (Datenbankzugänge für beide MySQL-Instanzen, MinIO-Credentials, GEMINI_API_KEY) werden im Code niemals fest hinterlegt. Lokal werden sie über docker-compose-Variablen gesetzt; im Zielbetrieb stammen sie aus AWS Secrets Manager und werden den Containern als Environment-Variablen injiziert.</w:t>
+      </w:r>
+    </w:p>
+    <w:p>
+      <w:pPr>
+        <w:pStyle w:val="berschrift2"/>
+      </w:pPr>
+      <w:r>
+        <w:t>DDR9: Zweite RDS-Instanz für die Orders-Datenbank</w:t>
+      </w:r>
+    </w:p>
+    <w:p>
+      <w:r>
+        <w:t>Die Orders-Datenbank (ACD13) wird im Zielbetrieb als eine weitere, getrennte AWS RDS for MySQL Instanz ausgerollt. Die physische Trennung von der Katalog-Instanz (DDR5) spiegelt die logische Trennung gemäß ADR11 wider und erlaubt: getrennte Backup-Pläne, eigene Wartungsfenster, differenzierte Storage- und Compute-Sizing-Profile (Orders ist transaktional schreibintensiv, Katalog ist lese-lastig) sowie unabhängige Compliance-Audits.</w:t>
       </w:r>
     </w:p>
     <w:sectPr>

</xml_diff>

<commit_message>
refactor: remove route-service from architecture and infrastructure while adding Statement of Work documentation
</commit_message>
<xml_diff>
--- a/docs/Architekturdokumentation.docx
+++ b/docs/Architekturdokumentation.docx
@@ -36,7 +36,7 @@
     </w:p>
     <w:p>
       <w:r>
-        <w:t>Aether Motors realisiert einen 3-Tier-Microservice-Webshop. Der Presentation Tier wird vollständig vom Web Shop Backend Server-seitig gerendert und dient gleichzeitig als API-Gateway zu den nachgelagerten Microservices. Der Business Logic Tier besteht aus sieben fachlich geschnittenen Services (Product, Cart, Order, Media, Route, AI, Roadmap). Der Data Tier umfasst zwei voneinander unabhängige MySQL-Instanzen (eine für den Produktkatalog, eine für Bestellungen), einen Redis-Cache für Warenkörbe sowie einen MinIO-Bucket für sämtliche Bildinhalte. Eine grafische Übersicht liefert das begleitende Foliendokument Architekturmodellierung.pptx.</w:t>
+        <w:t>Aether Motors realisiert einen 3-Tier-Microservice-Webshop. Der Presentation Tier wird vollständig vom Web Shop Backend Server-seitig gerendert und dient gleichzeitig als API-Gateway zu den nachgelagerten Microservices. Der Business Logic Tier besteht aus sechs fachlich geschnittenen Services (Product, Cart, Order, Media, AI, Roadmap). Der Data Tier umfasst zwei voneinander unabhängige MySQL-Instanzen (eine für den Produktkatalog, eine für Bestellungen), einen Redis-Cache für Warenkörbe sowie einen MinIO-Bucket für sämtliche Bildinhalte. Eine grafische Übersicht liefert das begleitende Foliendokument Architekturmodellierung.pptx.</w:t>
       </w:r>
     </w:p>
     <w:p>
@@ -73,7 +73,7 @@
     </w:p>
     <w:p>
       <w:r>
-        <w:t>Das Web Shop Backend (Express + EJS, Port 3000) erfüllt zwei Aufgaben: (1) Server-Side Rendering aller Seiten (Home, Konfigurator, Galerie, Merchandise, Cart, Roadmap, Route) und (2) API-Gateway, das HTTP-Aufrufe an die Microservices weiterleitet. Eingehende Requests werden ausschließlich vom Backend bedient; Microservices sind nicht direkt öffentlich erreichbar. Daten zu Fahrzeugen und Merchandise zieht das Backend zur Laufzeit über HTTP/JSON vom Product Information Service (siehe ACD3); ein lokaler Cache mit 60 s TTL verhindert eine DB-Anfrage pro Render. Das Backend ist einem unpredictable Workload ausgesetzt und muss daher elastisch horizontal skalieren (siehe ADR5).</w:t>
+        <w:t>Das Web Shop Backend (Express + EJS, Port 3000) erfüllt zwei Aufgaben: (1) Server-Side Rendering aller Seiten (Home, Konfigurator, Galerie, Merchandise, Cart, Roadmap) und (2) API-Gateway, das HTTP-Aufrufe an die Microservices weiterleitet. Eingehende Requests werden ausschließlich vom Backend bedient; Microservices sind nicht direkt öffentlich erreichbar. Daten zu Fahrzeugen und Merchandise zieht das Backend zur Laufzeit über HTTP/JSON vom Product Information Service (siehe ACD3); ein lokaler Cache mit 60 s TTL verhindert eine DB-Anfrage pro Render. Das Backend ist einem unpredictable Workload ausgesetzt und muss daher elastisch horizontal skalieren (siehe ADR5).</w:t>
       </w:r>
     </w:p>
     <w:p>
@@ -86,7 +86,7 @@
     </w:p>
     <w:p>
       <w:r>
-        <w:t>Der Product Information Service (Node.js, Port 3001) verwaltet sämtliche Stammdaten zu Fahrzeugen, Merchandise und allen Konfigurator-Optionen (Farben, Räder, Interieurs, Fahrwerke, Auspuffanlagen) inklusive der Verfügbarkeits-Joins pro Fahrzeug. Er stellt REST/JSON-Endpunkte unter /api/vehicles, /api/merchandise, /api/options und /api/search bereit und hält die Daten in der zugehörigen MySQL-Datenbank (siehe ACD10 und ADR7). Der Service ist – wie das Web Shop Backend – einem unpredictable Workload ausgesetzt und wird elastisch horizontal skaliert.</w:t>
+        <w:t>Der Product Information Service (Node.js, Port 3001) verwaltet sämtliche Stammdaten zu Fahrzeugen, Merchandise und allen Konfigurator-Optionen (Farben, Räder, Interieurs, Fahrwerke, Auspuffanlagen) inklusive der Verfügbarkeits-Joins pro Fahrzeug. Er stellt REST/JSON-Endpunkte unter /api/vehicles, /api/merchandise, /api/options und /api/search bereit und hält die Daten in der zugehörigen MySQL-Datenbank (siehe ACD9 und ADR7). Der Service ist – wie das Web Shop Backend – einem unpredictable Workload ausgesetzt und wird elastisch horizontal skaliert.</w:t>
       </w:r>
     </w:p>
     <w:p>
@@ -99,7 +99,7 @@
     </w:p>
     <w:p>
       <w:r>
-        <w:t>Der Shopping Cart Service (Node.js, Port 3002) verwaltet kundenspezifische Warenkörbe. Jeder Cart wird als JSON-Dokument in Redis unter dem Schlüssel aether:cart:&lt;cartId&gt; abgelegt und bei jeder Mutation mit einer Sliding TTL neu geschrieben (Default 24 h, siehe ADR8). Da viele Kunden parallel einkaufen, ist der Workload unpredictable; der Service skaliert horizontal hinter einem Load Balancer und ist selbst zustandslos – der gesamte Zustand liegt in Redis (siehe ACD11).</w:t>
+        <w:t>Der Shopping Cart Service (Node.js, Port 3002) verwaltet kundenspezifische Warenkörbe. Jeder Cart wird als JSON-Dokument in Redis unter dem Schlüssel aether:cart:&lt;cartId&gt; abgelegt und bei jeder Mutation mit einer Sliding TTL neu geschrieben (Default 24 h, siehe ADR8). Da viele Kunden parallel einkaufen, ist der Workload unpredictable; der Service skaliert horizontal hinter einem Load Balancer und ist selbst zustandslos – der gesamte Zustand liegt in Redis (siehe ACD10).</w:t>
       </w:r>
     </w:p>
     <w:p>
@@ -112,7 +112,7 @@
     </w:p>
     <w:p>
       <w:r>
-        <w:t>Der Order Service (Node.js, Port 3003) übernimmt Vehicle- und Merchandise-Bestellungen aus dem Checkout, persistiert sie und stellt Bestellhistorie-Endpunkte bereit. Bestellungen werden in der eigenen MySQL-Instanz aether_orders abgelegt (siehe ACD13 und ADR11); JSON-Felder wie Customer, Address, Config und Items werden serialisiert in TEXT-Spalten gespeichert. Der Service ist zustandslos und kann beliebig horizontal skalieren; der gesamte transaktionale Zustand liegt in der Datenbank.</w:t>
+        <w:t>Der Order Service (Node.js, Port 3003) übernimmt Vehicle- und Merchandise-Bestellungen aus dem Checkout, persistiert sie und stellt Bestellhistorie-Endpunkte bereit. Bestellungen werden in der eigenen MySQL-Instanz aether_orders abgelegt (siehe ACD12 und ADR11); JSON-Felder wie Customer, Address, Config und Items werden serialisiert in TEXT-Spalten gespeichert. Der Service ist zustandslos und kann beliebig horizontal skalieren; der gesamte transaktionale Zustand liegt in der Datenbank.</w:t>
       </w:r>
     </w:p>
     <w:p>
@@ -125,28 +125,15 @@
     </w:p>
     <w:p>
       <w:r>
-        <w:t>Der Media Service (Node.js, Port 3004) liefert Metadaten über die in MinIO abgelegten Bild-, Video- und 3D-Assets. Der Service streamt die Binärdaten selbst nicht aus, sondern verweist über öffentliche MinIO-URLs auf die Objekte (siehe ACD12 und ADR9). Dadurch bleibt die Antwortlatenz vorhersagbar und der Service skaliert praktisch beliebig, da er nur Metadaten ausliefert.</w:t>
-      </w:r>
-    </w:p>
-    <w:p>
-      <w:pPr>
-        <w:pStyle w:val="berschrift2"/>
-      </w:pPr>
-      <w:r>
-        <w:t>ACD7: Route Service</w:t>
-      </w:r>
-    </w:p>
-    <w:p>
-      <w:r>
-        <w:t>Der Route Service (Node.js, Port 3005) modelliert das Premiere-Event-Tracking, das auf der Startseite eingeblendet wird (Countdown, Live-Telemetrie, Wegpunkte zwischen Teststrecke und Pavillon). Der Service liefert ausschließlich statische bzw. mock-basierte Daten und ist daher zustandslos.</w:t>
-      </w:r>
-    </w:p>
-    <w:p>
-      <w:pPr>
-        <w:pStyle w:val="berschrift2"/>
-      </w:pPr>
-      <w:r>
-        <w:t>ACD8: AI Service</w:t>
+        <w:t>Der Media Service (Node.js, Port 3004) liefert Metadaten über die in MinIO abgelegten Bild-, Video- und 3D-Assets. Der Service streamt die Binärdaten selbst nicht aus, sondern verweist über öffentliche MinIO-URLs auf die Objekte (siehe ACD11 und ADR9). Dadurch bleibt die Antwortlatenz vorhersagbar und der Service skaliert praktisch beliebig, da er nur Metadaten ausliefert.</w:t>
+      </w:r>
+    </w:p>
+    <w:p>
+      <w:pPr>
+        <w:pStyle w:val="berschrift2"/>
+      </w:pPr>
+      <w:r>
+        <w:t>ACD7: AI Service</w:t>
       </w:r>
     </w:p>
     <w:p>
@@ -159,20 +146,20 @@
         <w:pStyle w:val="berschrift2"/>
       </w:pPr>
       <w:r>
-        <w:t>ACD9: Roadmap Service</w:t>
-      </w:r>
-    </w:p>
-    <w:p>
-      <w:r>
-        <w:t>Der Roadmap Service (Node.js, Port 3007) liefert die Produkt-Roadmap (Meilensteine, Releases, Marketing-Phasen). Wie der Route Service ist er rein lesend und zustandslos.</w:t>
-      </w:r>
-    </w:p>
-    <w:p>
-      <w:pPr>
-        <w:pStyle w:val="berschrift2"/>
-      </w:pPr>
-      <w:r>
-        <w:t>ACD10: Catalogue Database (MySQL, aether_motors)</w:t>
+        <w:t>ACD8: Roadmap Service</w:t>
+      </w:r>
+    </w:p>
+    <w:p>
+      <w:r>
+        <w:t>Der Roadmap Service (Node.js, Port 3007) liefert die Produkt-Roadmap (Meilensteine, Releases, Marketing-Phasen). Er ist rein lesend, hält die Daten in-memory und ist zustandslos – horizontal trivial skalierbar.</w:t>
+      </w:r>
+    </w:p>
+    <w:p>
+      <w:pPr>
+        <w:pStyle w:val="berschrift2"/>
+      </w:pPr>
+      <w:r>
+        <w:t>ACD9: Catalogue Database (MySQL, aether_motors)</w:t>
       </w:r>
     </w:p>
     <w:p>
@@ -185,7 +172,7 @@
         <w:pStyle w:val="berschrift2"/>
       </w:pPr>
       <w:r>
-        <w:t>ACD11: Cart Cache (Redis)</w:t>
+        <w:t>ACD10: Cart Cache (Redis)</w:t>
       </w:r>
     </w:p>
     <w:p>
@@ -198,7 +185,7 @@
         <w:pStyle w:val="berschrift2"/>
       </w:pPr>
       <w:r>
-        <w:t>ACD12: Media Object Storage (MinIO)</w:t>
+        <w:t>ACD11: Media Object Storage (MinIO)</w:t>
       </w:r>
     </w:p>
     <w:p>
@@ -211,7 +198,7 @@
         <w:pStyle w:val="berschrift2"/>
       </w:pPr>
       <w:r>
-        <w:t>ACD13: Orders Database (MySQL, aether_orders)</w:t>
+        <w:t>ACD12: Orders Database (MySQL, aether_orders)</w:t>
       </w:r>
     </w:p>
     <w:p>
@@ -240,7 +227,7 @@
     </w:p>
     <w:p>
       <w:r>
-        <w:t>Das System wird gemäß des Microservice-Architekturstils umgesetzt. Die einzelnen fachlichen Verantwortlichkeiten (Produktstammdaten, Warenkorb, Bestellungen, Medien, Routen, AI-Empfehlungen, Roadmap) lassen sich klar voneinander abgrenzen und besitzen jeweils starke interne Kohäsion. Microservices ermöglichen es, jede Komponente unabhängig zu entwickeln, zu deployen und zu skalieren.</w:t>
+        <w:t>Das System wird gemäß des Microservice-Architekturstils umgesetzt. Die einzelnen fachlichen Verantwortlichkeiten (Produktstammdaten, Warenkorb, Bestellungen, Medien, AI-Empfehlungen, Roadmap) lassen sich klar voneinander abgrenzen und besitzen jeweils starke interne Kohäsion. Microservices ermöglichen es, jede Komponente unabhängig zu entwickeln, zu deployen und zu skalieren.</w:t>
       </w:r>
     </w:p>
     <w:p>
@@ -253,7 +240,7 @@
     </w:p>
     <w:p>
       <w:r>
-        <w:t>Die Komponenten werden in drei Tiers gegliedert: Presentation Tier (Web Shop Backend mit SSR), Business Logic Tier (sieben Microservices) und Data Tier (zwei MySQL-Instanzen, Redis, MinIO). Diese Trennung erleichtert das Deployment (z. B. unterschiedliche Skalierungsstrategien je Tier) und die Absicherung (nur das Backend ist öffentlich erreichbar).</w:t>
+        <w:t>Die Komponenten werden in drei Tiers gegliedert: Presentation Tier (Web Shop Backend mit SSR), Business Logic Tier (sechs Microservices) und Data Tier (zwei MySQL-Instanzen, Redis, MinIO). Diese Trennung erleichtert das Deployment (z. B. unterschiedliche Skalierungsstrategien je Tier) und die Absicherung (nur das Backend ist öffentlich erreichbar).</w:t>
       </w:r>
     </w:p>
     <w:p>
@@ -446,7 +433,7 @@
     </w:p>
     <w:p>
       <w:r>
-        <w:t>Die fachlichen Microservices werden im Zielbetrieb in AWS ECS Fargate ausgeführt. Fargate liefert serverlose Container-Ausführung, eignet sich gut für die meist leichtgewichtigen Node-Services und erlaubt unterschiedliche Skalierungsprofile pro Service (Product und Cart elastisch, Roadmap und Route in fixer Replica-Zahl).</w:t>
+        <w:t>Die fachlichen Microservices werden im Zielbetrieb in AWS ECS Fargate ausgeführt. Fargate liefert serverlose Container-Ausführung, eignet sich gut für die meist leichtgewichtigen Node-Services und erlaubt unterschiedliche Skalierungsprofile pro Service (Product und Cart elastisch, Roadmap in fixer Replica-Zahl).</w:t>
       </w:r>
     </w:p>
     <w:p>
@@ -459,7 +446,7 @@
     </w:p>
     <w:p>
       <w:r>
-        <w:t>Die Katalog-Datenbank (ACD10) wird im Zielbetrieb als Managed-Service (AWS RDS for MySQL) bereitgestellt. RDS übernimmt Backups, Patching, Multi-AZ-Failover und Monitoring. Dies passt zu ADR6 und ADR7, ohne dass eine eigene Datenbank-Administration nötig wird.</w:t>
+        <w:t>Die Katalog-Datenbank (ACD9) wird im Zielbetrieb als Managed-Service (AWS RDS for MySQL) bereitgestellt. RDS übernimmt Backups, Patching, Multi-AZ-Failover und Monitoring. Dies passt zu ADR6 und ADR7, ohne dass eine eigene Datenbank-Administration nötig wird.</w:t>
       </w:r>
     </w:p>
     <w:p>
@@ -511,7 +498,7 @@
     </w:p>
     <w:p>
       <w:r>
-        <w:t>Die Orders-Datenbank (ACD13) wird im Zielbetrieb als eine weitere, getrennte AWS RDS for MySQL Instanz ausgerollt. Die physische Trennung von der Katalog-Instanz (DDR5) spiegelt die logische Trennung gemäß ADR11 wider und erlaubt: getrennte Backup-Pläne, eigene Wartungsfenster, differenzierte Storage- und Compute-Sizing-Profile (Orders ist transaktional schreibintensiv, Katalog ist lese-lastig) sowie unabhängige Compliance-Audits.</w:t>
+        <w:t>Die Orders-Datenbank (ACD12) wird im Zielbetrieb als eine weitere, getrennte AWS RDS for MySQL Instanz ausgerollt. Die physische Trennung von der Katalog-Instanz (DDR5) spiegelt die logische Trennung gemäß ADR11 wider und erlaubt: getrennte Backup-Pläne, eigene Wartungsfenster, differenzierte Storage- und Compute-Sizing-Profile (Orders ist transaktional schreibintensiv, Katalog ist lese-lastig) sowie unabhängige Compliance-Audits.</w:t>
       </w:r>
     </w:p>
     <w:sectPr>

</xml_diff>